<commit_message>
Add AI Automation: new Automation Setup package, portfolio + CV updates
</commit_message>
<xml_diff>
--- a/docs/Jola_Tacij_CV.docx
+++ b/docs/Jola_Tacij_CV.docx
@@ -29,7 +29,7 @@
           <w:bCs/>
           <w:color w:val="1B3361"/>
         </w:rPr>
-        <w:t>Senior Power BI Specialist  ·  MS SQL  ·  Data Visualisation  ·  Azure + Databricks</w:t>
+        <w:t>Senior Power BI Specialist  ·  MS SQL  ·  Data Visualisation  ·  Azure + Databricks  ·  AI Automation</w:t>
       </w:r>
     </w:p>
     <w:p>
@@ -1123,6 +1123,31 @@
     </w:p>
     <w:p>
       <w:pPr>
+        <w:spacing w:before="40" w:after="40"/>
+      </w:pPr>
+      <w:r>
+        <w:rPr>
+          <w:rFonts w:ascii="Calibri" w:eastAsia="Calibri" w:hAnsi="Calibri" w:cs="Calibri"/>
+          <w:b/>
+          <w:bCs/>
+          <w:color w:val="1B3361"/>
+          <w:sz w:val="19"/>
+          <w:szCs w:val="19"/>
+        </w:rPr>
+        <w:t xml:space="preserve">Automation &amp; AI:  </w:t>
+      </w:r>
+      <w:r>
+        <w:rPr>
+          <w:rFonts w:ascii="Calibri" w:eastAsia="Calibri" w:hAnsi="Calibri" w:cs="Calibri"/>
+          <w:color w:val="1A1A1A"/>
+          <w:sz w:val="19"/>
+          <w:szCs w:val="19"/>
+        </w:rPr>
+        <w:t>Make (AI Automations &amp; AI Agents)  ·  Power Automate  ·  API &amp; webhook integrations  ·  AI-driven workflows (lead routing, reporting, responses)</w:t>
+      </w:r>
+    </w:p>
+    <w:p>
+      <w:pPr>
         <w:spacing w:before="40" w:after="60"/>
       </w:pPr>
       <w:r>
@@ -1249,6 +1274,31 @@
     </w:p>
     <w:p>
       <w:pPr>
+        <w:spacing w:before="30" w:after="30"/>
+      </w:pPr>
+      <w:r>
+        <w:rPr>
+          <w:rFonts w:ascii="Calibri" w:eastAsia="Calibri" w:hAnsi="Calibri" w:cs="Calibri"/>
+          <w:b/>
+          <w:bCs/>
+          <w:color w:val="BF9000"/>
+          <w:sz w:val="19"/>
+          <w:szCs w:val="19"/>
+        </w:rPr>
+        <w:t>Make — from Beginner to Pro: AI Automations &amp; AI Agents</w:t>
+      </w:r>
+      <w:r>
+        <w:rPr>
+          <w:rFonts w:ascii="Calibri" w:eastAsia="Calibri" w:hAnsi="Calibri" w:cs="Calibri"/>
+          <w:color w:val="1A1A1A"/>
+          <w:sz w:val="19"/>
+          <w:szCs w:val="19"/>
+        </w:rPr>
+        <w:t xml:space="preserve"> — Udemy · Thalita Milan, 2026 (hands-on build-and-deploy of AI automations &amp; agents)</w:t>
+      </w:r>
+    </w:p>
+    <w:p>
+      <w:pPr>
         <w:spacing w:before="30" w:after="60"/>
       </w:pPr>
       <w:r>
@@ -1260,7 +1310,7 @@
           <w:sz w:val="19"/>
           <w:szCs w:val="19"/>
         </w:rPr>
-        <w:t>SQL Masterclass 2024 · SQL for Data Analytics &amp; BI · SSIS Part 1</w:t>
+        <w:t>SQL Masterclass 2024 · SQL for Data Analytics &amp; BI</w:t>
       </w:r>
       <w:r>
         <w:rPr>

</xml_diff>

<commit_message>
Update site: tagline, new preview image, meta
</commit_message>
<xml_diff>
--- a/docs/Jola_Tacij_CV.docx
+++ b/docs/Jola_Tacij_CV.docx
@@ -68,6 +68,32 @@
           <w:szCs w:val="18"/>
         </w:rPr>
         <w:t>www.jolaandco.com</w:t>
+      </w:r>
+      <w:hyperlink r:id="rId5" w:tgtFrame="_blank" w:history="1">
+        <w:r>
+          <w:rPr>
+            <w:rStyle w:val="Hyperlink"/>
+            <w:b/>
+            <w:bCs/>
+          </w:rPr>
+          <w:t> </w:t>
+        </w:r>
+      </w:hyperlink>
+    </w:p>
+    <w:p>
+      <w:pPr>
+        <w:spacing w:after="80"/>
+      </w:pPr>
+      <w:r>
+        <w:rPr>
+          <w:rFonts w:ascii="Calibri" w:eastAsia="Calibri" w:hAnsi="Calibri" w:cs="Calibri"/>
+          <w:b/>
+          <w:bCs/>
+          <w:color w:val="9F8551"/>
+          <w:sz w:val="20"/>
+          <w:szCs w:val="18"/>
+        </w:rPr>
+        <w:t>AUTOMATE  ·  ANALYSE  ·  ADVANCE</w:t>
       </w:r>
       <w:hyperlink r:id="rId5" w:tgtFrame="_blank" w:history="1">
         <w:r>

</xml_diff>